<commit_message>
CR Domain Overview v1.0 -> v1.1: CR-MARKETING SDO carry-forward
Updates applied as a result of CR-MARKETING Sub-Domain Overview v1.0:

- Metadata: Version 1.0 -> 1.1, Depends On updated to reference new
  upstream document versions (Master PRD v2.4, Contact Entity PRD v1.3,
  Account Entity PRD v1.2)
- Section 4.7 Open Issues Carried Forward: closed CON-ISS-001,
  CON-ISS-008, ACT-ISS-001 with rationale pointing to the Sub-Domain
  Overview and the resulting field additions; ACT-ISS-004 marked as
  superseded in scope by CR-MARKETING-ISS-001 (geographic targeting
  model deferred to stakeholder input)
- Section 5 Updates to Prior Documents: existing Master PRD MST-PER-013
  update marked as applied; 5 new carry-forward update entries added
  for Master PRD v2.4 (Section 5.4), Contact Entity PRD v1.3 (8 new
  fields), Account Entity PRD v1.2 (clientStatus), MN-INTAKE v2.3 (4
  new requirements), and Entity Inventory v1.3 (Campaign entities,
  pending)
</commit_message>
<xml_diff>
--- a/PRDs/CR/CBM-Domain-Overview-ClientRecruiting.docx
+++ b/PRDs/CR/CBM-Domain-Overview-ClientRecruiting.docx
@@ -92,18 +92,8 @@
             </w:tcBorders>
           </w:tcPr>
           <w:p>
-            <w:pPr>
-              <w:pStyle w:val="Normal"/>
-              <w:rPr/>
-            </w:pPr>
-            <w:r>
-              <w:rPr>
-                <w:b w:val="false"/>
-                <w:bCs w:val="false"/>
-                <w:sz w:val="22"/>
-                <w:szCs w:val="22"/>
-              </w:rPr>
-              <w:t>1.0</w:t>
+            <w:r>
+              <w:t>1.1</w:t>
             </w:r>
           </w:p>
         </w:tc>
@@ -202,18 +192,8 @@
             </w:tcBorders>
           </w:tcPr>
           <w:p>
-            <w:pPr>
-              <w:pStyle w:val="Normal"/>
-              <w:rPr/>
-            </w:pPr>
-            <w:r>
-              <w:rPr>
-                <w:b w:val="false"/>
-                <w:bCs w:val="false"/>
-                <w:sz w:val="22"/>
-                <w:szCs w:val="22"/>
-              </w:rPr>
-              <w:t>04-05-26 21:00</w:t>
+            <w:r>
+              <w:t>04-08-26 18:27</w:t>
             </w:r>
           </w:p>
         </w:tc>
@@ -312,18 +292,8 @@
             </w:tcBorders>
           </w:tcPr>
           <w:p>
-            <w:pPr>
-              <w:pStyle w:val="Normal"/>
-              <w:rPr/>
-            </w:pPr>
-            <w:r>
-              <w:rPr>
-                <w:b w:val="false"/>
-                <w:bCs w:val="false"/>
-                <w:sz w:val="22"/>
-                <w:szCs w:val="22"/>
-              </w:rPr>
-              <w:t>CBM-Master-PRD.docx v2.2, CBM-Entity-Inventory.docx v1.2, Contact-Entity-PRD.docx v1.1, Account-Entity-PRD.docx v1.0</w:t>
+            <w:r>
+              <w:t>CBM-Master-PRD.docx v2.4, CBM-Entity-Inventory.docx v1.2, Contact-Entity-PRD.docx v1.3, Account-Entity-PRD.docx v1.2</w:t>
             </w:r>
           </w:p>
         </w:tc>
@@ -5289,18 +5259,8 @@
             </w:tcBorders>
           </w:tcPr>
           <w:p>
-            <w:pPr>
-              <w:pStyle w:val="Normal"/>
-              <w:rPr/>
-            </w:pPr>
-            <w:r>
-              <w:rPr>
-                <w:b w:val="false"/>
-                <w:bCs w:val="false"/>
-                <w:sz w:val="22"/>
-                <w:szCs w:val="22"/>
-              </w:rPr>
-              <w:t>Client lifecycle field not yet defined. To be established during CR process definition or MN-INTAKE Entity PRD work.</w:t>
+            <w:r>
+              <w:t>CLOSED (CR-MARKETING SDO v1.0): Resolved by the prospectStatus field added to the Contact Entity PRD v1.3 paired with the clientStatus field added to the Account Entity PRD v1.2. The two-field model tracks marketing-funnel state on Contact and client-relationship state on Account, answering two different questions without ambiguity.</w:t>
             </w:r>
           </w:p>
         </w:tc>
@@ -5532,18 +5492,8 @@
             </w:tcBorders>
           </w:tcPr>
           <w:p>
-            <w:pPr>
-              <w:pStyle w:val="Normal"/>
-              <w:rPr/>
-            </w:pPr>
-            <w:r>
-              <w:rPr>
-                <w:b w:val="false"/>
-                <w:bCs w:val="false"/>
-                <w:sz w:val="22"/>
-                <w:szCs w:val="22"/>
-              </w:rPr>
-              <w:t>How Did You Hear About CBM dropdown values not yet defined by CBM leadership.</w:t>
+            <w:r>
+              <w:t>CLOSED (CR-MARKETING SDO v1.0): How Did You Hear About CBM enum value list finalized as 10 values: Partner Referral, Workshop or Event, Email Marketing, Social Media, Search Engine, CBM Website, News or Media, Personal Referral, Returning Client, Other. Values map to CR sub-domains for channel effectiveness rollup reporting. Resolved in Contact Entity PRD v1.3.</w:t>
             </w:r>
           </w:p>
         </w:tc>
@@ -5613,18 +5563,8 @@
             </w:tcBorders>
           </w:tcPr>
           <w:p>
-            <w:pPr>
-              <w:pStyle w:val="Normal"/>
-              <w:rPr/>
-            </w:pPr>
-            <w:r>
-              <w:rPr>
-                <w:b w:val="false"/>
-                <w:bCs w:val="false"/>
-                <w:sz w:val="22"/>
-                <w:szCs w:val="22"/>
-              </w:rPr>
-              <w:t>Client lifecycle field not yet defined on Account. To be established during CR process definition.</w:t>
+            <w:r>
+              <w:t>CLOSED (CR-MARKETING SDO v1.0): Resolved by the clientStatus field added to the Account Entity PRD v1.2. The Account-level client lifecycle is now tracked via clientStatus, paired with Contact.prospectStatus on the Contact entity for the marketing-funnel state of individual people.</w:t>
             </w:r>
           </w:p>
         </w:tc>
@@ -5775,18 +5715,8 @@
             </w:tcBorders>
           </w:tcPr>
           <w:p>
-            <w:pPr>
-              <w:pStyle w:val="Normal"/>
-              <w:rPr/>
-            </w:pPr>
-            <w:r>
-              <w:rPr>
-                <w:b w:val="false"/>
-                <w:bCs w:val="false"/>
-                <w:sz w:val="22"/>
-                <w:szCs w:val="22"/>
-              </w:rPr>
-              <w:t>Geographic Service Area field format (free text vs. controlled list) not yet decided by CBM leadership.</w:t>
+            <w:r>
+              <w:t>Geographic Service Area field format (free text vs. controlled list) not yet decided by CBM leadership. Superseded in scope by CR-MARKETING-ISS-001 (geographic targeting model deferred to stakeholder input). Resolution will happen jointly with CR-MARKETING-ISS-001 when stakeholder input is available.</w:t>
             </w:r>
           </w:p>
         </w:tc>
@@ -5928,18 +5858,8 @@
             </w:tcBorders>
           </w:tcPr>
           <w:p>
-            <w:pPr>
-              <w:pStyle w:val="Normal"/>
-              <w:rPr/>
-            </w:pPr>
-            <w:r>
-              <w:rPr>
-                <w:b w:val="false"/>
-                <w:bCs w:val="false"/>
-                <w:sz w:val="22"/>
-                <w:szCs w:val="22"/>
-              </w:rPr>
-              <w:t>CBM-Master-PRD.docx v2.2</w:t>
+            <w:r>
+              <w:t>CBM-Master-PRD.docx v2.2 (applied in v2.3)</w:t>
             </w:r>
           </w:p>
         </w:tc>
@@ -5954,18 +5874,8 @@
             </w:tcBorders>
           </w:tcPr>
           <w:p>
-            <w:pPr>
-              <w:pStyle w:val="Normal"/>
-              <w:rPr/>
-            </w:pPr>
-            <w:r>
-              <w:rPr>
-                <w:b w:val="false"/>
-                <w:bCs w:val="false"/>
-                <w:sz w:val="22"/>
-                <w:szCs w:val="22"/>
-              </w:rPr>
-              <w:t>Add MST-PER-013 (Client) to CR domain persona list</w:t>
+            <w:r>
+              <w:t>Add MST-PER-013 (Client) to CR domain persona list (applied)</w:t>
             </w:r>
           </w:p>
         </w:tc>
@@ -5992,6 +5902,281 @@
                 <w:szCs w:val="22"/>
               </w:rPr>
               <w:t>The Client persona’s definition lists “Client Recruiting” as a primary domain, and the legacy CR Domain PRD includes them in CR-EVENTS. The CR domain exists to locate and recruit clients, making them a participating persona. The persona list in Section 3.5 should include MST-PER-013.</w:t>
+            </w:r>
+          </w:p>
+        </w:tc>
+      </w:tr>
+      <w:tr>
+        <w:trPr/>
+        <w:tc>
+          <w:tcPr>
+            <w:tcW w:w="2199" w:type="dxa"/>
+            <w:tcBorders>
+              <w:top w:val="single" w:sz="2" w:space="0" w:color="CCCCCC"/>
+              <w:left w:val="single" w:sz="2" w:space="0" w:color="CCCCCC"/>
+              <w:bottom w:val="single" w:sz="2" w:space="0" w:color="CCCCCC"/>
+              <w:right w:val="single" w:sz="2" w:space="0" w:color="CCCCCC"/>
+            </w:tcBorders>
+          </w:tcPr>
+          <w:p>
+            <w:r>
+              <w:t xml:space="preserve">CBM-Master-PRD.docx v2.3 (applied in v2.4)</w:t>
+            </w:r>
+          </w:p>
+        </w:tc>
+        <w:tc>
+          <w:tcPr>
+            <w:tcW w:w="3001" w:type="dxa"/>
+            <w:tcBorders>
+              <w:top w:val="single" w:sz="2" w:space="0" w:color="CCCCCC"/>
+              <w:left w:val="single" w:sz="2" w:space="0" w:color="CCCCCC"/>
+              <w:bottom w:val="single" w:sz="2" w:space="0" w:color="CCCCCC"/>
+              <w:right w:val="single" w:sz="2" w:space="0" w:color="CCCCCC"/>
+            </w:tcBorders>
+          </w:tcPr>
+          <w:p>
+            <w:r>
+              <w:t xml:space="preserve">Add Section 5.4 referencing the Universal Contact-Creation Rules (applied)</w:t>
+            </w:r>
+          </w:p>
+        </w:tc>
+        <w:tc>
+          <w:tcPr>
+            <w:tcW w:w="4160" w:type="dxa"/>
+            <w:tcBorders>
+              <w:top w:val="single" w:sz="2" w:space="0" w:color="CCCCCC"/>
+              <w:left w:val="single" w:sz="2" w:space="0" w:color="CCCCCC"/>
+              <w:bottom w:val="single" w:sz="2" w:space="0" w:color="CCCCCC"/>
+              <w:right w:val="single" w:sz="2" w:space="0" w:color="CCCCCC"/>
+            </w:tcBorders>
+          </w:tcPr>
+          <w:p>
+            <w:pPr>
+              <w:pStyle w:val="Normal"/>
+              <w:rPr/>
+            </w:pPr>
+            <w:r>
+              <w:t xml:space="preserve">The CR-MARKETING Sub-Domain Overview v1.0 formalized 5 universal rules for Contact creation that apply CRM-wide across all domains. The Master PRD Section 5 (System Scope) needed a reference so other domains know to follow the principle. Applied as Section 5.4 in Master PRD v2.4.</w:t>
+            </w:r>
+          </w:p>
+        </w:tc>
+      </w:tr>
+      <w:tr>
+        <w:trPr/>
+        <w:tc>
+          <w:tcPr>
+            <w:tcW w:w="2199" w:type="dxa"/>
+            <w:tcBorders>
+              <w:top w:val="single" w:sz="2" w:space="0" w:color="CCCCCC"/>
+              <w:left w:val="single" w:sz="2" w:space="0" w:color="CCCCCC"/>
+              <w:bottom w:val="single" w:sz="2" w:space="0" w:color="CCCCCC"/>
+              <w:right w:val="single" w:sz="2" w:space="0" w:color="CCCCCC"/>
+            </w:tcBorders>
+          </w:tcPr>
+          <w:p>
+            <w:r>
+              <w:t xml:space="preserve">Contact-Entity-PRD.docx v1.2 (applied in v1.3)</w:t>
+            </w:r>
+          </w:p>
+        </w:tc>
+        <w:tc>
+          <w:tcPr>
+            <w:tcW w:w="3001" w:type="dxa"/>
+            <w:tcBorders>
+              <w:top w:val="single" w:sz="2" w:space="0" w:color="CCCCCC"/>
+              <w:left w:val="single" w:sz="2" w:space="0" w:color="CCCCCC"/>
+              <w:bottom w:val="single" w:sz="2" w:space="0" w:color="CCCCCC"/>
+              <w:right w:val="single" w:sz="2" w:space="0" w:color="CCCCCC"/>
+            </w:tcBorders>
+          </w:tcPr>
+          <w:p>
+            <w:r>
+              <w:t xml:space="preserve">Add 8 new fields, finalize howDidYouHearAboutCbm enum, update narrative (applied)</w:t>
+            </w:r>
+          </w:p>
+        </w:tc>
+        <w:tc>
+          <w:tcPr>
+            <w:tcW w:w="4160" w:type="dxa"/>
+            <w:tcBorders>
+              <w:top w:val="single" w:sz="2" w:space="0" w:color="CCCCCC"/>
+              <w:left w:val="single" w:sz="2" w:space="0" w:color="CCCCCC"/>
+              <w:bottom w:val="single" w:sz="2" w:space="0" w:color="CCCCCC"/>
+              <w:right w:val="single" w:sz="2" w:space="0" w:color="CCCCCC"/>
+            </w:tcBorders>
+          </w:tcPr>
+          <w:p>
+            <w:pPr>
+              <w:pStyle w:val="Normal"/>
+              <w:rPr/>
+            </w:pPr>
+            <w:r>
+              <w:t xml:space="preserve">The CR-MARKETING Sub-Domain Overview v1.0 surfaced 8 new fields for the Contact entity (prospectStatus, sourceAttributionDetails, emailOptOut, smsOptOut, plus 4 marketing engagement roll-ups) and finalized the 10-value howDidYouHearAboutCbm enum. Applied as Section 3.5 in Contact Entity PRD v1.3, which also closes CON-ISS-001 and CON-ISS-008.</w:t>
+            </w:r>
+          </w:p>
+        </w:tc>
+      </w:tr>
+      <w:tr>
+        <w:trPr/>
+        <w:tc>
+          <w:tcPr>
+            <w:tcW w:w="2199" w:type="dxa"/>
+            <w:tcBorders>
+              <w:top w:val="single" w:sz="2" w:space="0" w:color="CCCCCC"/>
+              <w:left w:val="single" w:sz="2" w:space="0" w:color="CCCCCC"/>
+              <w:bottom w:val="single" w:sz="2" w:space="0" w:color="CCCCCC"/>
+              <w:right w:val="single" w:sz="2" w:space="0" w:color="CCCCCC"/>
+            </w:tcBorders>
+          </w:tcPr>
+          <w:p>
+            <w:r>
+              <w:t xml:space="preserve">Account-Entity-PRD.docx v1.1 (applied in v1.2)</w:t>
+            </w:r>
+          </w:p>
+        </w:tc>
+        <w:tc>
+          <w:tcPr>
+            <w:tcW w:w="3001" w:type="dxa"/>
+            <w:tcBorders>
+              <w:top w:val="single" w:sz="2" w:space="0" w:color="CCCCCC"/>
+              <w:left w:val="single" w:sz="2" w:space="0" w:color="CCCCCC"/>
+              <w:bottom w:val="single" w:sz="2" w:space="0" w:color="CCCCCC"/>
+              <w:right w:val="single" w:sz="2" w:space="0" w:color="CCCCCC"/>
+            </w:tcBorders>
+          </w:tcPr>
+          <w:p>
+            <w:r>
+              <w:t xml:space="preserve">Add clientStatus field, document native website field as matching signal (applied)</w:t>
+            </w:r>
+          </w:p>
+        </w:tc>
+        <w:tc>
+          <w:tcPr>
+            <w:tcW w:w="4160" w:type="dxa"/>
+            <w:tcBorders>
+              <w:top w:val="single" w:sz="2" w:space="0" w:color="CCCCCC"/>
+              <w:left w:val="single" w:sz="2" w:space="0" w:color="CCCCCC"/>
+              <w:bottom w:val="single" w:sz="2" w:space="0" w:color="CCCCCC"/>
+              <w:right w:val="single" w:sz="2" w:space="0" w:color="CCCCCC"/>
+            </w:tcBorders>
+          </w:tcPr>
+          <w:p>
+            <w:pPr>
+              <w:pStyle w:val="Normal"/>
+              <w:rPr/>
+            </w:pPr>
+            <w:r>
+              <w:t xml:space="preserve">The CR-MARKETING Sub-Domain Overview v1.0 surfaced a new clientStatus field tracking the client-relationship lifecycle at the Account level, paired with Contact.prospectStatus. The Sub-Domain Overview also formalized that the native Account.website field is the primary signal for prospect-Contact-to-Account matching. Applied in Account Entity PRD v1.2, which closes ACT-ISS-001.</w:t>
+            </w:r>
+          </w:p>
+        </w:tc>
+      </w:tr>
+      <w:tr>
+        <w:trPr/>
+        <w:tc>
+          <w:tcPr>
+            <w:tcW w:w="2199" w:type="dxa"/>
+            <w:tcBorders>
+              <w:top w:val="single" w:sz="2" w:space="0" w:color="CCCCCC"/>
+              <w:left w:val="single" w:sz="2" w:space="0" w:color="CCCCCC"/>
+              <w:bottom w:val="single" w:sz="2" w:space="0" w:color="CCCCCC"/>
+              <w:right w:val="single" w:sz="2" w:space="0" w:color="CCCCCC"/>
+            </w:tcBorders>
+          </w:tcPr>
+          <w:p>
+            <w:r>
+              <w:t xml:space="preserve">MN-INTAKE.docx v2.2 (applied in v2.3)</w:t>
+            </w:r>
+          </w:p>
+        </w:tc>
+        <w:tc>
+          <w:tcPr>
+            <w:tcW w:w="3001" w:type="dxa"/>
+            <w:tcBorders>
+              <w:top w:val="single" w:sz="2" w:space="0" w:color="CCCCCC"/>
+              <w:left w:val="single" w:sz="2" w:space="0" w:color="CCCCCC"/>
+              <w:bottom w:val="single" w:sz="2" w:space="0" w:color="CCCCCC"/>
+              <w:right w:val="single" w:sz="2" w:space="0" w:color="CCCCCC"/>
+            </w:tcBorders>
+          </w:tcPr>
+          <w:p>
+            <w:r>
+              <w:t xml:space="preserve">Add 4 new requirements for prospect-to-applicant handoff (applied)</w:t>
+            </w:r>
+          </w:p>
+        </w:tc>
+        <w:tc>
+          <w:tcPr>
+            <w:tcW w:w="4160" w:type="dxa"/>
+            <w:tcBorders>
+              <w:top w:val="single" w:sz="2" w:space="0" w:color="CCCCCC"/>
+              <w:left w:val="single" w:sz="2" w:space="0" w:color="CCCCCC"/>
+              <w:bottom w:val="single" w:sz="2" w:space="0" w:color="CCCCCC"/>
+              <w:right w:val="single" w:sz="2" w:space="0" w:color="CCCCCC"/>
+            </w:tcBorders>
+          </w:tcPr>
+          <w:p>
+            <w:pPr>
+              <w:pStyle w:val="Normal"/>
+              <w:rPr/>
+            </w:pPr>
+            <w:r>
+              <w:t xml:space="preserve">The CR-MARKETING Sub-Domain Overview v1.0 established that prospect Contacts exist in the CRM before application, requiring MN-INTAKE to handle the prospect-Contact-already-exists case, transition Account.clientStatus and Contact.prospectStatus at application processing time, and respect the layered authority policy when writing howDidYouHearAboutCbm. Applied as MN-INTAKE-REQ-010 through MN-INTAKE-REQ-013 in MN-INTAKE v2.3, which closes MN-INTAKE-ISS-002.</w:t>
+            </w:r>
+          </w:p>
+        </w:tc>
+      </w:tr>
+      <w:tr>
+        <w:trPr/>
+        <w:tc>
+          <w:tcPr>
+            <w:tcW w:w="2199" w:type="dxa"/>
+            <w:tcBorders>
+              <w:top w:val="single" w:sz="2" w:space="0" w:color="CCCCCC"/>
+              <w:left w:val="single" w:sz="2" w:space="0" w:color="CCCCCC"/>
+              <w:bottom w:val="single" w:sz="2" w:space="0" w:color="CCCCCC"/>
+              <w:right w:val="single" w:sz="2" w:space="0" w:color="CCCCCC"/>
+            </w:tcBorders>
+          </w:tcPr>
+          <w:p>
+            <w:r>
+              <w:t xml:space="preserve">CBM-Entity-Inventory.docx v1.2 (pending)</w:t>
+            </w:r>
+          </w:p>
+        </w:tc>
+        <w:tc>
+          <w:tcPr>
+            <w:tcW w:w="3001" w:type="dxa"/>
+            <w:tcBorders>
+              <w:top w:val="single" w:sz="2" w:space="0" w:color="CCCCCC"/>
+              <w:left w:val="single" w:sz="2" w:space="0" w:color="CCCCCC"/>
+              <w:bottom w:val="single" w:sz="2" w:space="0" w:color="CCCCCC"/>
+              <w:right w:val="single" w:sz="2" w:space="0" w:color="CCCCCC"/>
+            </w:tcBorders>
+          </w:tcPr>
+          <w:p>
+            <w:r>
+              <w:t xml:space="preserve">Resolve Campaign row; add Campaign Group and Campaign Engagement rows (pending)</w:t>
+            </w:r>
+          </w:p>
+        </w:tc>
+        <w:tc>
+          <w:tcPr>
+            <w:tcW w:w="4160" w:type="dxa"/>
+            <w:tcBorders>
+              <w:top w:val="single" w:sz="2" w:space="0" w:color="CCCCCC"/>
+              <w:left w:val="single" w:sz="2" w:space="0" w:color="CCCCCC"/>
+              <w:bottom w:val="single" w:sz="2" w:space="0" w:color="CCCCCC"/>
+              <w:right w:val="single" w:sz="2" w:space="0" w:color="CCCCCC"/>
+            </w:tcBorders>
+          </w:tcPr>
+          <w:p>
+            <w:pPr>
+              <w:pStyle w:val="Normal"/>
+              <w:rPr/>
+            </w:pPr>
+            <w:r>
+              <w:t xml:space="preserve">The CR-MARKETING Sub-Domain Overview v1.0 surfaced three new custom Base entities owned by CR (Campaign, Campaign Group, Campaign Engagement). The existing Campaign row in the Entity Inventory has TBD type/status that should be resolved to custom Base, owned by CR. Two new rows should be added for Campaign Group and Campaign Engagement. All three Entity PRDs are deferred to Phase 2b after CR-MARKETING-CAMPAIGNS process definition.</w:t>
             </w:r>
           </w:p>
         </w:tc>

</xml_diff>

<commit_message>
Apply carry-forward updates from CR-EVENTS and CR-REACTIVATE
Four carry-forward updates applied:
- Contact Entity PRD v1.4 → v1.5: add presenterBio, presenterTopics
  (new Section 3.6), lastConversionPushSentAt, lastReactivationSentAt
  (Section 3.5); update Section 5.7 narrative
- Account Entity PRD v1.4 → v1.5: add applicantSince to Section 3.2
- MN-INTAKE v2.3 → v2.4: extend REQ-011 with applicantSince clause;
  add applicantSince to Data Collected as DAT-027
- CR Domain Overview v1.1 → v1.2: add CR-EVENTS-ISS-001 to Section
  4.7; add carry-forward entries to Section 5; update Depends On

CLAUDE.md updated with new versions, carry-forwards marked complete,
Phase 9 follow-up version targets adjusted (v1.5 → v1.6).

Co-Authored-By: Claude Opus 4.6 (1M context) <noreply@anthropic.com>
</commit_message>
<xml_diff>
--- a/PRDs/CR/CBM-Domain-Overview-ClientRecruiting.docx
+++ b/PRDs/CR/CBM-Domain-Overview-ClientRecruiting.docx
@@ -93,7 +93,7 @@
           </w:tcPr>
           <w:p>
             <w:r>
-              <w:t>1.1</w:t>
+              <w:t>1.2</w:t>
             </w:r>
           </w:p>
         </w:tc>
@@ -193,7 +193,7 @@
           </w:tcPr>
           <w:p>
             <w:r>
-              <w:t>04-08-26 18:27</w:t>
+              <w:t>04-16-26 01:15</w:t>
             </w:r>
           </w:p>
         </w:tc>
@@ -293,7 +293,7 @@
           </w:tcPr>
           <w:p>
             <w:r>
-              <w:t>CBM-Master-PRD.docx v2.4, CBM-Entity-Inventory.docx v1.2, Contact-Entity-PRD.docx v1.3, Account-Entity-PRD.docx v1.2</w:t>
+              <w:t>CBM-Master-PRD.docx v2.5, CBM-Entity-Inventory.docx v1.4, Contact-Entity-PRD.docx v1.5, Account-Entity-PRD.docx v1.5</w:t>
             </w:r>
           </w:p>
         </w:tc>
@@ -5721,6 +5721,38 @@
           </w:p>
         </w:tc>
       </w:tr>
+      <w:tr>
+        <w:tc>
+          <w:tcPr>
+            <w:tcW w:type="dxa" w:w="1799"/>
+          </w:tcPr>
+          <w:p>
+            <w:r>
+              <w:t>CR-EVENTS-ISS-001</w:t>
+            </w:r>
+          </w:p>
+        </w:tc>
+        <w:tc>
+          <w:tcPr>
+            <w:tcW w:type="dxa" w:w="2201"/>
+          </w:tcPr>
+          <w:p>
+            <w:r>
+              <w:t>CR-EVENTS Sub-Domain Overview</w:t>
+            </w:r>
+          </w:p>
+        </w:tc>
+        <w:tc>
+          <w:tcPr>
+            <w:tcW w:type="dxa" w:w="5360"/>
+          </w:tcPr>
+          <w:p>
+            <w:r>
+              <w:t>Event feedback surveys deferred to the future Survey Service definition. Event feedback data collection and analysis are out of scope for CR-EVENTS v1.0. To be addressed when the Survey Service is defined as a Cross-Domain Service PRD (Phase 6).</w:t>
+            </w:r>
+          </w:p>
+        </w:tc>
+      </w:tr>
     </w:tbl>
     <w:p>
       <w:pPr>
@@ -6177,6 +6209,102 @@
             </w:pPr>
             <w:r>
               <w:t xml:space="preserve">The CR-MARKETING Sub-Domain Overview v1.0 surfaced three new custom Base entities owned by CR (Campaign, Campaign Group, Campaign Engagement). The existing Campaign row in the Entity Inventory has TBD type/status that should be resolved to custom Base, owned by CR. Two new rows should be added for Campaign Group and Campaign Engagement. All three Entity PRDs are deferred to Phase 2b after CR-MARKETING-CAMPAIGNS process definition.</w:t>
+            </w:r>
+          </w:p>
+        </w:tc>
+      </w:tr>
+      <w:tr>
+        <w:tc>
+          <w:tcPr>
+            <w:tcW w:type="dxa" w:w="2199"/>
+          </w:tcPr>
+          <w:p>
+            <w:r>
+              <w:t>Contact-Entity-PRD.docx v1.4 (applied in v1.5)</w:t>
+            </w:r>
+          </w:p>
+        </w:tc>
+        <w:tc>
+          <w:tcPr>
+            <w:tcW w:type="dxa" w:w="3001"/>
+          </w:tcPr>
+          <w:p>
+            <w:r>
+              <w:t>Add presenterBio, presenterTopics, lastConversionPushSentAt, lastReactivationSentAt fields; update Section 5.7 narrative (applied)</w:t>
+            </w:r>
+          </w:p>
+        </w:tc>
+        <w:tc>
+          <w:tcPr>
+            <w:tcW w:type="dxa" w:w="4160"/>
+          </w:tcPr>
+          <w:p>
+            <w:r>
+              <w:t>CR-EVENTS Sub-Domain Overview v1.0 surfaced two presenter-specific fields. CR-EVENTS-CONVERT v1.0 and CR-REACTIVATE Sub-Domain Overview v1.0 surfaced outreach tracking timestamp fields.</w:t>
+            </w:r>
+          </w:p>
+        </w:tc>
+      </w:tr>
+      <w:tr>
+        <w:tc>
+          <w:tcPr>
+            <w:tcW w:type="dxa" w:w="2199"/>
+          </w:tcPr>
+          <w:p>
+            <w:r>
+              <w:t>Account-Entity-PRD.docx v1.4 (applied in v1.5)</w:t>
+            </w:r>
+          </w:p>
+        </w:tc>
+        <w:tc>
+          <w:tcPr>
+            <w:tcW w:type="dxa" w:w="3001"/>
+          </w:tcPr>
+          <w:p>
+            <w:r>
+              <w:t>Add applicantSince field (applied)</w:t>
+            </w:r>
+          </w:p>
+        </w:tc>
+        <w:tc>
+          <w:tcPr>
+            <w:tcW w:type="dxa" w:w="4160"/>
+          </w:tcPr>
+          <w:p>
+            <w:r>
+              <w:t>CR-EVENTS-CONVERT v1.0 introduced applicantSince as the application-side anchor for conversion window calculation, system-populated by MN-INTAKE.</w:t>
+            </w:r>
+          </w:p>
+        </w:tc>
+      </w:tr>
+      <w:tr>
+        <w:tc>
+          <w:tcPr>
+            <w:tcW w:type="dxa" w:w="2199"/>
+          </w:tcPr>
+          <w:p>
+            <w:r>
+              <w:t>MN-INTAKE.docx v2.3 (applied in v2.4)</w:t>
+            </w:r>
+          </w:p>
+        </w:tc>
+        <w:tc>
+          <w:tcPr>
+            <w:tcW w:type="dxa" w:w="3001"/>
+          </w:tcPr>
+          <w:p>
+            <w:r>
+              <w:t>Extend REQ-011 to populate Account.applicantSince (applied)</w:t>
+            </w:r>
+          </w:p>
+        </w:tc>
+        <w:tc>
+          <w:tcPr>
+            <w:tcW w:type="dxa" w:w="4160"/>
+          </w:tcPr>
+          <w:p>
+            <w:r>
+              <w:t>CR-EVENTS-CONVERT v1.0 requires MN-INTAKE to system-populate Account.applicantSince with the current datetime when clientStatus transitions to Applicant.</w:t>
             </w:r>
           </w:p>
         </w:tc>

</xml_diff>

<commit_message>
CR Domain Overview v1.4 -> v1.5: register CR-RESOURCES as the fifth sub-domain
- "four" -> "five" sub-domains throughout the narrative and structure.
- Added CR-RESOURCES to the sub-domain table and CR-RESOURCES-MANAGE to the
  process inventory; new 3.6 CR-RESOURCES subsection (subsequent 3.x
  subsections renumbered 3.7-3.10); Resource entity added to the Section 4
  entity summary.
- Reflects the event-publishing/discovery and Resources-page changes. v1.5 log row.
</commit_message>
<xml_diff>
--- a/PRDs/CR/CBM-Domain-Overview-ClientRecruiting.docx
+++ b/PRDs/CR/CBM-Domain-Overview-ClientRecruiting.docx
@@ -93,7 +93,7 @@
           </w:tcPr>
           <w:p>
             <w:r>
-              <w:t>1.4</w:t>
+              <w:t>1.5</w:t>
             </w:r>
           </w:p>
         </w:tc>
@@ -193,7 +193,7 @@
           </w:tcPr>
           <w:p>
             <w:r>
-              <w:t>04-30-26 04:58</w:t>
+              <w:t>05-29-26 16:30</w:t>
             </w:r>
           </w:p>
         </w:tc>
@@ -339,18 +339,18 @@
       </w:pPr>
       <w:r>
         <w:rPr/>
-        <w:t>Client Recruiting operates through four complementary sub-domains. Partner Relationship Management extends CBM’s reach into communities through formal partnerships with organizations that refer clients, contribute mentors, and co-sponsor programming. Outreach and Marketing generates awareness through communications channels including digital presence, content marketing, email campaigns, media relations, and direct grassroots outreach. Workshops and Event Management creates direct touchpoints with the business community through in-person and virtual events. Client Reactivation and Recovery maximizes return on prior recruiting investment by re-engaging former clients, incomplete applicants, and unconverted event attendees.</w:t>
-      </w:r>
-    </w:p>
-    <w:p>
-      <w:pPr>
-        <w:pStyle w:val="Normal"/>
-        <w:spacing w:before="0" w:after="200"/>
-        <w:rPr/>
-      </w:pPr>
-      <w:r>
-        <w:rPr/>
-        <w:t>These four sub-domains are not separate programs — they are coordinated channels within a single domain united by the goal of connecting the right clients to CBM’s mentoring services. Partners co-sponsor events. Events generate attendees who become clients. Marketing campaigns promote events and follow up on partner referrals. Reactivation outreach recycles warm leads from all three other channels. The domain is designed to support this coordination through unified oversight, cross-sub-domain reporting, comparative channel effectiveness analysis, and a shared audience strategy for targeted community segments.</w:t>
+        <w:t>Client Recruiting operates through five complementary sub-domains. Partner Relationship Management extends CBM’s reach into communities through formal partnerships with organizations that refer clients, contribute mentors, and co-sponsor programming. Outreach and Marketing generates awareness through communications channels including digital presence, content marketing, email campaigns, media relations, and direct grassroots outreach. Workshops and Event Management creates direct touchpoints with the business community through in-person and virtual events. Client Reactivation and Recovery maximizes return on prior recruiting investment by re-engaging former clients, incomplete applicants, and unconverted event attendees.</w:t>
+      </w:r>
+    </w:p>
+    <w:p>
+      <w:pPr>
+        <w:pStyle w:val="Normal"/>
+        <w:spacing w:before="0" w:after="200"/>
+        <w:rPr/>
+      </w:pPr>
+      <w:r>
+        <w:rPr/>
+        <w:t>These five sub-domains are not separate programs — they are coordinated channels within a single domain united by the goal of connecting the right clients to CBM’s mentoring services. Partners co-sponsor events. Events generate attendees who become clients. Marketing campaigns promote events and follow up on partner referrals. Reactivation outreach recycles warm leads from all three other channels. The domain is designed to support this coordination through unified oversight, cross-sub-domain reporting, comparative channel effectiveness analysis, and a shared audience strategy for targeted community segments.</w:t>
       </w:r>
     </w:p>
     <w:p>
@@ -383,7 +383,7 @@
       </w:pPr>
       <w:r>
         <w:rPr/>
-        <w:t>The Client Recruiting domain is organized into four sub-domains. Sub-domains are appropriate when autonomous process areas share a common purpose and benefit from unified oversight. Each CR sub-domain operates autonomously with its own process inventory, personas, and data, while the parent domain provides cross-sub-domain coordination, shared audience strategy, and consolidated analytics.</w:t>
+        <w:t>The Client Recruiting domain is organized into five sub-domains. Sub-domains are appropriate when autonomous process areas share a common purpose and benefit from unified oversight. Each CR sub-domain operates autonomously with its own process inventory, personas, and data, while the parent domain provides cross-sub-domain coordination, shared audience strategy, and consolidated analytics.</w:t>
       </w:r>
     </w:p>
     <w:tbl>
@@ -940,6 +940,113 @@
                 <w:szCs w:val="22"/>
               </w:rPr>
               <w:t>Important</w:t>
+            </w:r>
+          </w:p>
+        </w:tc>
+      </w:tr>
+      <w:tr>
+        <w:trPr/>
+        <w:tc>
+          <w:tcPr>
+            <w:tcW w:w="2199" w:type="dxa"/>
+            <w:tcBorders>
+              <w:top w:val="single" w:sz="2" w:space="0" w:color="CCCCCC"/>
+              <w:left w:val="single" w:sz="2" w:space="0" w:color="CCCCCC"/>
+              <w:bottom w:val="single" w:sz="2" w:space="0" w:color="CCCCCC"/>
+              <w:right w:val="single" w:sz="2" w:space="0" w:color="CCCCCC"/>
+            </w:tcBorders>
+          </w:tcPr>
+          <w:p>
+            <w:pPr>
+              <w:pStyle w:val="Normal"/>
+              <w:rPr/>
+            </w:pPr>
+            <w:r>
+              <w:rPr>
+                <w:b/>
+                <w:bCs/>
+                <w:sz w:val="22"/>
+                <w:szCs w:val="22"/>
+              </w:rPr>
+              <w:t>CR-RESOURCES</w:t>
+            </w:r>
+          </w:p>
+        </w:tc>
+        <w:tc>
+          <w:tcPr>
+            <w:tcW w:w="3200" w:type="dxa"/>
+            <w:tcBorders>
+              <w:top w:val="single" w:sz="2" w:space="0" w:color="CCCCCC"/>
+              <w:left w:val="single" w:sz="2" w:space="0" w:color="CCCCCC"/>
+              <w:bottom w:val="single" w:sz="2" w:space="0" w:color="CCCCCC"/>
+              <w:right w:val="single" w:sz="2" w:space="0" w:color="CCCCCC"/>
+            </w:tcBorders>
+          </w:tcPr>
+          <w:p>
+            <w:pPr>
+              <w:pStyle w:val="Normal"/>
+              <w:rPr/>
+            </w:pPr>
+            <w:r>
+              <w:rPr>
+                <w:b w:val="false"/>
+                <w:bCs w:val="false"/>
+                <w:sz w:val="22"/>
+                <w:szCs w:val="22"/>
+              </w:rPr>
+              <w:t>Resource Library</w:t>
+            </w:r>
+          </w:p>
+        </w:tc>
+        <w:tc>
+          <w:tcPr>
+            <w:tcW w:w="2400" w:type="dxa"/>
+            <w:tcBorders>
+              <w:top w:val="single" w:sz="2" w:space="0" w:color="CCCCCC"/>
+              <w:left w:val="single" w:sz="2" w:space="0" w:color="CCCCCC"/>
+              <w:bottom w:val="single" w:sz="2" w:space="0" w:color="CCCCCC"/>
+              <w:right w:val="single" w:sz="2" w:space="0" w:color="CCCCCC"/>
+            </w:tcBorders>
+          </w:tcPr>
+          <w:p>
+            <w:pPr>
+              <w:pStyle w:val="Normal"/>
+              <w:rPr/>
+            </w:pPr>
+            <w:r>
+              <w:rPr>
+                <w:b w:val="false"/>
+                <w:bCs w:val="false"/>
+                <w:sz w:val="22"/>
+                <w:szCs w:val="22"/>
+              </w:rPr>
+              <w:t>Publishing recordings and standalone assets to a public Resources page</w:t>
+            </w:r>
+          </w:p>
+        </w:tc>
+        <w:tc>
+          <w:tcPr>
+            <w:tcW w:w="1560" w:type="dxa"/>
+            <w:tcBorders>
+              <w:top w:val="single" w:sz="2" w:space="0" w:color="CCCCCC"/>
+              <w:left w:val="single" w:sz="2" w:space="0" w:color="CCCCCC"/>
+              <w:bottom w:val="single" w:sz="2" w:space="0" w:color="CCCCCC"/>
+              <w:right w:val="single" w:sz="2" w:space="0" w:color="CCCCCC"/>
+            </w:tcBorders>
+          </w:tcPr>
+          <w:p>
+            <w:pPr>
+              <w:pStyle w:val="Normal"/>
+              <w:rPr/>
+            </w:pPr>
+            <w:r>
+              <w:rPr>
+                <w:b w:val="false"/>
+                <w:bCs w:val="false"/>
+                <w:sz w:val="22"/>
+                <w:szCs w:val="22"/>
+              </w:rPr>
+              <w:t>Enhancement</w:t>
             </w:r>
           </w:p>
         </w:tc>
@@ -1734,7 +1841,7 @@
       </w:pPr>
       <w:r>
         <w:rPr/>
-        <w:t>The Client Recruiting domain contains seven business processes organized across four sub-domains. Processes are listed in recommended production order within each sub-domain.</w:t>
+        <w:t>The Client Recruiting domain contains seven business processes organized across five sub-domains. Processes are listed in recommended production order within each sub-domain.</w:t>
       </w:r>
     </w:p>
     <w:p>
@@ -2627,6 +2734,113 @@
           </w:p>
         </w:tc>
       </w:tr>
+      <w:tr>
+        <w:trPr/>
+        <w:tc>
+          <w:tcPr>
+            <w:tcW w:w="2600" w:type="dxa"/>
+            <w:tcBorders>
+              <w:top w:val="single" w:sz="2" w:space="0" w:color="CCCCCC"/>
+              <w:left w:val="single" w:sz="2" w:space="0" w:color="CCCCCC"/>
+              <w:bottom w:val="single" w:sz="2" w:space="0" w:color="CCCCCC"/>
+              <w:right w:val="single" w:sz="2" w:space="0" w:color="CCCCCC"/>
+            </w:tcBorders>
+          </w:tcPr>
+          <w:p>
+            <w:pPr>
+              <w:pStyle w:val="Normal"/>
+              <w:rPr/>
+            </w:pPr>
+            <w:r>
+              <w:rPr>
+                <w:b w:val="false"/>
+                <w:bCs w:val="false"/>
+                <w:sz w:val="22"/>
+                <w:szCs w:val="22"/>
+              </w:rPr>
+              <w:t>CR-RESOURCES-MANAGE</w:t>
+            </w:r>
+          </w:p>
+        </w:tc>
+        <w:tc>
+          <w:tcPr>
+            <w:tcW w:w="3399" w:type="dxa"/>
+            <w:tcBorders>
+              <w:top w:val="single" w:sz="2" w:space="0" w:color="CCCCCC"/>
+              <w:left w:val="single" w:sz="2" w:space="0" w:color="CCCCCC"/>
+              <w:bottom w:val="single" w:sz="2" w:space="0" w:color="CCCCCC"/>
+              <w:right w:val="single" w:sz="2" w:space="0" w:color="CCCCCC"/>
+            </w:tcBorders>
+          </w:tcPr>
+          <w:p>
+            <w:pPr>
+              <w:pStyle w:val="Normal"/>
+              <w:rPr/>
+            </w:pPr>
+            <w:r>
+              <w:rPr>
+                <w:b w:val="false"/>
+                <w:bCs w:val="false"/>
+                <w:sz w:val="22"/>
+                <w:szCs w:val="22"/>
+              </w:rPr>
+              <w:t>Resource Library Management</w:t>
+            </w:r>
+          </w:p>
+        </w:tc>
+        <w:tc>
+          <w:tcPr>
+            <w:tcW w:w="1800" w:type="dxa"/>
+            <w:tcBorders>
+              <w:top w:val="single" w:sz="2" w:space="0" w:color="CCCCCC"/>
+              <w:left w:val="single" w:sz="2" w:space="0" w:color="CCCCCC"/>
+              <w:bottom w:val="single" w:sz="2" w:space="0" w:color="CCCCCC"/>
+              <w:right w:val="single" w:sz="2" w:space="0" w:color="CCCCCC"/>
+            </w:tcBorders>
+          </w:tcPr>
+          <w:p>
+            <w:pPr>
+              <w:pStyle w:val="Normal"/>
+              <w:rPr/>
+            </w:pPr>
+            <w:r>
+              <w:rPr>
+                <w:b w:val="false"/>
+                <w:bCs w:val="false"/>
+                <w:sz w:val="22"/>
+                <w:szCs w:val="22"/>
+              </w:rPr>
+              <w:t>CR-RESOURCES</w:t>
+            </w:r>
+          </w:p>
+        </w:tc>
+        <w:tc>
+          <w:tcPr>
+            <w:tcW w:w="1560" w:type="dxa"/>
+            <w:tcBorders>
+              <w:top w:val="single" w:sz="2" w:space="0" w:color="CCCCCC"/>
+              <w:left w:val="single" w:sz="2" w:space="0" w:color="CCCCCC"/>
+              <w:bottom w:val="single" w:sz="2" w:space="0" w:color="CCCCCC"/>
+              <w:right w:val="single" w:sz="2" w:space="0" w:color="CCCCCC"/>
+            </w:tcBorders>
+          </w:tcPr>
+          <w:p>
+            <w:pPr>
+              <w:pStyle w:val="Normal"/>
+              <w:rPr/>
+            </w:pPr>
+            <w:r>
+              <w:rPr>
+                <w:b w:val="false"/>
+                <w:bCs w:val="false"/>
+                <w:sz w:val="22"/>
+                <w:szCs w:val="22"/>
+              </w:rPr>
+              <w:t>Enhancement</w:t>
+            </w:r>
+          </w:p>
+        </w:tc>
+      </w:tr>
     </w:tbl>
     <w:p>
       <w:pPr>
@@ -3071,12 +3285,65 @@
     <w:p>
       <w:pPr>
         <w:pStyle w:val="Heading2"/>
+      </w:pPr>
+      <w:r>
+        <w:rPr>
+          <w:rFonts w:ascii="Arial" w:cs="Arial" w:eastAsia="Arial" w:hAnsi="Arial"/>
+        </w:rPr>
+        <w:t xml:space="preserve">3.6 CR-RESOURCES — Resource Library</w:t>
+      </w:r>
+    </w:p>
+    <w:p>
+      <w:r>
+        <w:rPr>
+          <w:rFonts w:ascii="Arial" w:cs="Arial" w:eastAsia="Arial" w:hAnsi="Arial"/>
+          <w:sz w:val="22"/>
+          <w:szCs w:val="22"/>
+        </w:rPr>
+        <w:t xml:space="preserve">CR-RESOURCES manages the public Resources page — a library of recordings of past events and standalone assets offered to the business community. It turns finished content into published, publicly accessible resources and keeps that library current and organized. It is the fifth Client Recruiting sub-domain.</w:t>
+      </w:r>
+    </w:p>
+    <w:p>
+      <w:r>
+        <w:rPr>
+          <w:rFonts w:ascii="Arial" w:cs="Arial" w:eastAsia="Arial" w:hAnsi="Arial"/>
+          <w:b/>
+          <w:bCs/>
+          <w:sz w:val="22"/>
+          <w:szCs w:val="22"/>
+        </w:rPr>
+        <w:t xml:space="preserve">CR-RESOURCES-MANAGE — Resource Library Management</w:t>
+      </w:r>
+    </w:p>
+    <w:p>
+      <w:r>
+        <w:rPr>
+          <w:rFonts w:ascii="Arial" w:cs="Arial" w:eastAsia="Arial" w:hAnsi="Arial"/>
+          <w:sz w:val="22"/>
+          <w:szCs w:val="22"/>
+        </w:rPr>
+        <w:t xml:space="preserve">Migrates recordings from completed events into published resources, publishes standalone assets, and maintains the public page. The Resource entity is owned here; visibility is gated solely by a publish flag, and the page requires no sign-in.</w:t>
+      </w:r>
+    </w:p>
+    <w:p>
+      <w:r>
+        <w:rPr>
+          <w:rFonts w:ascii="Arial" w:cs="Arial" w:eastAsia="Arial" w:hAnsi="Arial"/>
+          <w:sz w:val="22"/>
+          <w:szCs w:val="22"/>
+        </w:rPr>
+        <w:t xml:space="preserve">Dependency: CR-RESOURCES depends on CR-EVENTS. Recordings originate from completed events, each recording resource links back to its source event, and the recording-migration step continues off the end of CR-EVENTS-MANAGE. The dependency is read-only on the Events side — this sub-domain follows the event’s raw recording link to retrieve content but never modifies event data.</w:t>
+      </w:r>
+    </w:p>
+    <w:p>
+      <w:pPr>
+        <w:pStyle w:val="Heading2"/>
         <w:spacing w:before="240" w:after="200"/>
         <w:rPr/>
       </w:pPr>
       <w:r>
         <w:rPr/>
-        <w:t>3.6 Process Production Order</w:t>
+        <w:t>3.7 Process Production Order</w:t>
       </w:r>
     </w:p>
     <w:p>
@@ -3778,7 +4045,7 @@
       </w:pPr>
       <w:r>
         <w:rPr/>
-        <w:t>3.7 Cross-Sub-Domain Relationships and Handoffs</w:t>
+        <w:t>3.8 Cross-Sub-Domain Relationships and Handoffs</w:t>
       </w:r>
     </w:p>
     <w:p>
@@ -3890,7 +4157,7 @@
       </w:pPr>
       <w:r>
         <w:rPr/>
-        <w:t>3.8 Handoff to Mentoring Domain</w:t>
+        <w:t>3.9 Handoff to Mentoring Domain</w:t>
       </w:r>
     </w:p>
     <w:p>
@@ -3923,18 +4190,18 @@
       </w:pPr>
       <w:r>
         <w:rPr/>
-        <w:t>3.9 Shared Audience Strategy and Consolidated Oversight</w:t>
-      </w:r>
-    </w:p>
-    <w:p>
-      <w:pPr>
-        <w:pStyle w:val="Normal"/>
-        <w:spacing w:before="0" w:after="200"/>
-        <w:rPr/>
-      </w:pPr>
-      <w:r>
-        <w:rPr/>
-        <w:t>The four sub-domains are different channels all targeting the same general audience — small businesses and entrepreneurs in Northeast Ohio who could benefit from mentoring. Consolidated oversight at the parent domain level serves three purposes.</w:t>
+        <w:t>3.10 Shared Audience Strategy and Consolidated Oversight</w:t>
+      </w:r>
+    </w:p>
+    <w:p>
+      <w:pPr>
+        <w:pStyle w:val="Normal"/>
+        <w:spacing w:before="0" w:after="200"/>
+        <w:rPr/>
+      </w:pPr>
+      <w:r>
+        <w:rPr/>
+        <w:t>The five sub-domains are different channels all targeting the same general audience — small businesses and entrepreneurs in Northeast Ohio who could benefit from mentoring. Consolidated oversight at the parent domain level serves three purposes.</w:t>
       </w:r>
     </w:p>
     <w:p>
@@ -3988,7 +4255,7 @@
       </w:r>
       <w:r>
         <w:rPr/>
-        <w:t>If the active client population is underrepresented in a particular geography, industry, or business stage, all four sub-domains can orient toward that gap — partners in that area, marketing campaigns targeting that segment, events in that location, reactivation outreach to former clients in that category.</w:t>
+        <w:t>If the active client population is underrepresented in a particular geography, industry, or business stage, all five sub-domains can orient toward that gap — partners in that area, marketing campaigns targeting that segment, events in that location, reactivation outreach to former clients in that category.</w:t>
       </w:r>
     </w:p>
     <w:p>
@@ -4606,6 +4873,113 @@
                 <w:sz w:val="22"/>
                 <w:szCs w:val="22"/>
               </w:rPr>
+              <w:t>Resource</w:t>
+            </w:r>
+          </w:p>
+        </w:tc>
+        <w:tc>
+          <w:tcPr>
+            <w:tcW w:w="1200" w:type="dxa"/>
+            <w:tcBorders>
+              <w:top w:val="single" w:sz="2" w:space="0" w:color="CCCCCC"/>
+              <w:left w:val="single" w:sz="2" w:space="0" w:color="CCCCCC"/>
+              <w:bottom w:val="single" w:sz="2" w:space="0" w:color="CCCCCC"/>
+              <w:right w:val="single" w:sz="2" w:space="0" w:color="CCCCCC"/>
+            </w:tcBorders>
+          </w:tcPr>
+          <w:p>
+            <w:pPr>
+              <w:pStyle w:val="Normal"/>
+              <w:rPr/>
+            </w:pPr>
+            <w:r>
+              <w:rPr>
+                <w:b w:val="false"/>
+                <w:bCs w:val="false"/>
+                <w:sz w:val="22"/>
+                <w:szCs w:val="22"/>
+              </w:rPr>
+              <w:t>Custom Base</w:t>
+            </w:r>
+          </w:p>
+        </w:tc>
+        <w:tc>
+          <w:tcPr>
+            <w:tcW w:w="1200" w:type="dxa"/>
+            <w:tcBorders>
+              <w:top w:val="single" w:sz="2" w:space="0" w:color="CCCCCC"/>
+              <w:left w:val="single" w:sz="2" w:space="0" w:color="CCCCCC"/>
+              <w:bottom w:val="single" w:sz="2" w:space="0" w:color="CCCCCC"/>
+              <w:right w:val="single" w:sz="2" w:space="0" w:color="CCCCCC"/>
+            </w:tcBorders>
+          </w:tcPr>
+          <w:p>
+            <w:pPr>
+              <w:pStyle w:val="Normal"/>
+              <w:rPr/>
+            </w:pPr>
+            <w:r>
+              <w:rPr>
+                <w:b w:val="false"/>
+                <w:bCs w:val="false"/>
+                <w:sz w:val="22"/>
+                <w:szCs w:val="22"/>
+              </w:rPr>
+              <w:t>Deferred</w:t>
+            </w:r>
+          </w:p>
+        </w:tc>
+        <w:tc>
+          <w:tcPr>
+            <w:tcW w:w="4959" w:type="dxa"/>
+            <w:tcBorders>
+              <w:top w:val="single" w:sz="2" w:space="0" w:color="CCCCCC"/>
+              <w:left w:val="single" w:sz="2" w:space="0" w:color="CCCCCC"/>
+              <w:bottom w:val="single" w:sz="2" w:space="0" w:color="CCCCCC"/>
+              <w:right w:val="single" w:sz="2" w:space="0" w:color="CCCCCC"/>
+            </w:tcBorders>
+          </w:tcPr>
+          <w:p>
+            <w:pPr>
+              <w:pStyle w:val="Normal"/>
+              <w:rPr/>
+            </w:pPr>
+            <w:r>
+              <w:rPr>
+                <w:b w:val="false"/>
+                <w:bCs w:val="false"/>
+                <w:sz w:val="22"/>
+                <w:szCs w:val="22"/>
+              </w:rPr>
+              <w:t>Public Resources page content: recordings of past events and standalone assets, gated solely by a publish flag. Owned by CR-RESOURCES.</w:t>
+            </w:r>
+          </w:p>
+        </w:tc>
+      </w:tr>
+      <w:tr>
+        <w:trPr/>
+        <w:tc>
+          <w:tcPr>
+            <w:tcW w:w="2000" w:type="dxa"/>
+            <w:tcBorders>
+              <w:top w:val="single" w:sz="2" w:space="0" w:color="CCCCCC"/>
+              <w:left w:val="single" w:sz="2" w:space="0" w:color="CCCCCC"/>
+              <w:bottom w:val="single" w:sz="2" w:space="0" w:color="CCCCCC"/>
+              <w:right w:val="single" w:sz="2" w:space="0" w:color="CCCCCC"/>
+            </w:tcBorders>
+          </w:tcPr>
+          <w:p>
+            <w:pPr>
+              <w:pStyle w:val="Normal"/>
+              <w:rPr/>
+            </w:pPr>
+            <w:r>
+              <w:rPr>
+                <w:b w:val="false"/>
+                <w:bCs w:val="false"/>
+                <w:sz w:val="22"/>
+                <w:szCs w:val="22"/>
+              </w:rPr>
               <w:t>Event Registration</w:t>
             </w:r>
           </w:p>
@@ -7313,57 +7687,93 @@
         </w:tc>
       </w:tr>
       <w:tr>
-        <w:trPr/>
-        <w:tc>
-          <w:tcPr>
-            <w:tcW w:w="1200" w:type="dxa"/>
-            <w:tcBorders>
-              <w:top w:val="single" w:sz="2" w:space="0" w:color="CCCCCC"/>
-              <w:left w:val="single" w:sz="2" w:space="0" w:color="CCCCCC"/>
-              <w:bottom w:val="single" w:sz="2" w:space="0" w:color="CCCCCC"/>
-              <w:right w:val="single" w:sz="2" w:space="0" w:color="CCCCCC"/>
-            </w:tcBorders>
-          </w:tcPr>
-          <w:p>
-            <w:r>
-              <w:rPr>
+        <w:tc>
+          <w:tcPr>
+            <w:tcW w:type="dxa" w:w="1200"/>
+            <w:tcBorders>
+              <w:top w:val="single" w:color="AAAAAA" w:sz="1"/>
+              <w:left w:val="single" w:color="AAAAAA" w:sz="1"/>
+              <w:bottom w:val="single" w:color="AAAAAA" w:sz="1"/>
+              <w:right w:val="single" w:color="AAAAAA" w:sz="1"/>
+            </w:tcBorders>
+            <w:shd w:fill="F2F7FB" w:val="clear"/>
+            <w:tcMar>
+              <w:top w:type="dxa" w:w="60"/>
+              <w:left w:type="dxa" w:w="100"/>
+              <w:bottom w:type="dxa" w:w="60"/>
+              <w:right w:type="dxa" w:w="100"/>
+            </w:tcMar>
+          </w:tcPr>
+          <w:p>
+            <w:r>
+              <w:rPr>
+                <w:rFonts w:ascii="Arial" w:cs="Arial" w:eastAsia="Arial" w:hAnsi="Arial"/>
                 <w:b/>
-              </w:rPr>
-              <w:t>1.4</w:t>
-            </w:r>
-          </w:p>
-        </w:tc>
-        <w:tc>
-          <w:tcPr>
-            <w:tcW w:w="1700" w:type="dxa"/>
-            <w:tcBorders>
-              <w:top w:val="single" w:sz="2" w:space="0" w:color="CCCCCC"/>
-              <w:left w:val="single" w:sz="2" w:space="0" w:color="CCCCCC"/>
-              <w:bottom w:val="single" w:sz="2" w:space="0" w:color="CCCCCC"/>
-              <w:right w:val="single" w:sz="2" w:space="0" w:color="CCCCCC"/>
-            </w:tcBorders>
-          </w:tcPr>
-          <w:p>
-            <w:r>
-              <w:rPr/>
-              <w:t>04-30-26 04:58</w:t>
-            </w:r>
-          </w:p>
-        </w:tc>
-        <w:tc>
-          <w:tcPr>
-            <w:tcW w:w="6460" w:type="dxa"/>
-            <w:tcBorders>
-              <w:top w:val="single" w:sz="2" w:space="0" w:color="CCCCCC"/>
-              <w:left w:val="single" w:sz="2" w:space="0" w:color="CCCCCC"/>
-              <w:bottom w:val="single" w:sz="2" w:space="0" w:color="CCCCCC"/>
-              <w:right w:val="single" w:sz="2" w:space="0" w:color="CCCCCC"/>
-            </w:tcBorders>
-          </w:tcPr>
-          <w:p>
-            <w:r>
-              <w:rPr/>
-              <w:t>Carry-forward from FU-REPORT process definition session, 04-30-26. Section 4 narrative paragraph 'Geographic Service Area format (ACT-ISS-004)' rewritten to reflect ACT-ISS-004 closure and the structured zip code list resolution, used for both Partner service areas and Donor/Sponsor funding territories. Section 6 Open Issues table ACT-ISS-004 row updated to CLOSED status. CR-MARKETING-ISS-001 remains open. Carry-forward request at PRDs/FU/carry-forward/SESSION-PROMPT-carry-forward-account-territory-zipcode-list.md.</w:t>
+                <w:bCs/>
+                <w:sz w:val="20"/>
+                <w:szCs w:val="20"/>
+              </w:rPr>
+              <w:t xml:space="preserve">1.5</w:t>
+            </w:r>
+          </w:p>
+        </w:tc>
+        <w:tc>
+          <w:tcPr>
+            <w:tcW w:type="dxa" w:w="1700"/>
+            <w:tcBorders>
+              <w:top w:val="single" w:color="AAAAAA" w:sz="1"/>
+              <w:left w:val="single" w:color="AAAAAA" w:sz="1"/>
+              <w:bottom w:val="single" w:color="AAAAAA" w:sz="1"/>
+              <w:right w:val="single" w:color="AAAAAA" w:sz="1"/>
+            </w:tcBorders>
+            <w:shd w:fill="F2F7FB" w:val="clear"/>
+            <w:tcMar>
+              <w:top w:type="dxa" w:w="60"/>
+              <w:left w:type="dxa" w:w="100"/>
+              <w:bottom w:type="dxa" w:w="60"/>
+              <w:right w:type="dxa" w:w="100"/>
+            </w:tcMar>
+          </w:tcPr>
+          <w:p>
+            <w:r>
+              <w:rPr>
+                <w:rFonts w:ascii="Arial" w:cs="Arial" w:eastAsia="Arial" w:hAnsi="Arial"/>
+                <w:b w:val="false"/>
+                <w:bCs w:val="false"/>
+                <w:sz w:val="20"/>
+                <w:szCs w:val="20"/>
+              </w:rPr>
+              <w:t xml:space="preserve">05-29-26 16:30</w:t>
+            </w:r>
+          </w:p>
+        </w:tc>
+        <w:tc>
+          <w:tcPr>
+            <w:tcW w:type="dxa" w:w="6460"/>
+            <w:tcBorders>
+              <w:top w:val="single" w:color="AAAAAA" w:sz="1"/>
+              <w:left w:val="single" w:color="AAAAAA" w:sz="1"/>
+              <w:bottom w:val="single" w:color="AAAAAA" w:sz="1"/>
+              <w:right w:val="single" w:color="AAAAAA" w:sz="1"/>
+            </w:tcBorders>
+            <w:shd w:fill="F2F7FB" w:val="clear"/>
+            <w:tcMar>
+              <w:top w:type="dxa" w:w="60"/>
+              <w:left w:type="dxa" w:w="100"/>
+              <w:bottom w:type="dxa" w:w="60"/>
+              <w:right w:type="dxa" w:w="100"/>
+            </w:tcMar>
+          </w:tcPr>
+          <w:p>
+            <w:r>
+              <w:rPr>
+                <w:rFonts w:ascii="Arial" w:cs="Arial" w:eastAsia="Arial" w:hAnsi="Arial"/>
+                <w:b w:val="false"/>
+                <w:bCs w:val="false"/>
+                <w:sz w:val="20"/>
+                <w:szCs w:val="20"/>
+              </w:rPr>
+              <w:t xml:space="preserve">Registered CR-RESOURCES as the fifth Client Recruiting sub-domain (four → five): added the sub-domain table row, the CR-RESOURCES-MANAGE process-inventory row, the 3.6 CR-RESOURCES subsection (subsequent 3.x subsections renumbered), and the Resource entity in the Section 4 entity summary. Reflects the event-publishing/discovery and Resources-page changes.</w:t>
             </w:r>
           </w:p>
         </w:tc>
@@ -7384,6 +7794,62 @@
             <w:r>
               <w:rPr>
                 <w:b/>
+              </w:rPr>
+              <w:t>1.4</w:t>
+            </w:r>
+          </w:p>
+        </w:tc>
+        <w:tc>
+          <w:tcPr>
+            <w:tcW w:w="1700" w:type="dxa"/>
+            <w:tcBorders>
+              <w:top w:val="single" w:sz="2" w:space="0" w:color="CCCCCC"/>
+              <w:left w:val="single" w:sz="2" w:space="0" w:color="CCCCCC"/>
+              <w:bottom w:val="single" w:sz="2" w:space="0" w:color="CCCCCC"/>
+              <w:right w:val="single" w:sz="2" w:space="0" w:color="CCCCCC"/>
+            </w:tcBorders>
+          </w:tcPr>
+          <w:p>
+            <w:r>
+              <w:rPr/>
+              <w:t>04-30-26 04:58</w:t>
+            </w:r>
+          </w:p>
+        </w:tc>
+        <w:tc>
+          <w:tcPr>
+            <w:tcW w:w="6460" w:type="dxa"/>
+            <w:tcBorders>
+              <w:top w:val="single" w:sz="2" w:space="0" w:color="CCCCCC"/>
+              <w:left w:val="single" w:sz="2" w:space="0" w:color="CCCCCC"/>
+              <w:bottom w:val="single" w:sz="2" w:space="0" w:color="CCCCCC"/>
+              <w:right w:val="single" w:sz="2" w:space="0" w:color="CCCCCC"/>
+            </w:tcBorders>
+          </w:tcPr>
+          <w:p>
+            <w:r>
+              <w:rPr/>
+              <w:t>Carry-forward from FU-REPORT process definition session, 04-30-26. Section 4 narrative paragraph 'Geographic Service Area format (ACT-ISS-004)' rewritten to reflect ACT-ISS-004 closure and the structured zip code list resolution, used for both Partner service areas and Donor/Sponsor funding territories. Section 6 Open Issues table ACT-ISS-004 row updated to CLOSED status. CR-MARKETING-ISS-001 remains open. Carry-forward request at PRDs/FU/carry-forward/SESSION-PROMPT-carry-forward-account-territory-zipcode-list.md.</w:t>
+            </w:r>
+          </w:p>
+        </w:tc>
+      </w:tr>
+      <w:tr>
+        <w:trPr/>
+        <w:tc>
+          <w:tcPr>
+            <w:tcW w:w="1200" w:type="dxa"/>
+            <w:tcBorders>
+              <w:top w:val="single" w:sz="2" w:space="0" w:color="CCCCCC"/>
+              <w:left w:val="single" w:sz="2" w:space="0" w:color="CCCCCC"/>
+              <w:bottom w:val="single" w:sz="2" w:space="0" w:color="CCCCCC"/>
+              <w:right w:val="single" w:sz="2" w:space="0" w:color="CCCCCC"/>
+            </w:tcBorders>
+          </w:tcPr>
+          <w:p>
+            <w:r>
+              <w:rPr>
+                <w:b/>
                 <w:bCs/>
               </w:rPr>
               <w:t>1.0</w:t>
@@ -7418,7 +7884,7 @@
           </w:tcPr>
           <w:p>
             <w:r>
-              <w:t>Initial CR Domain Overview. Establishes the CR domain purpose, four sub-domains (CR-PARTNER, CR-MARKETING, CR-EVENTS, CR-REACTIVATE), seven processes in dependency order, persona scoping, entity summary, and open-issues carried forward.</w:t>
+              <w:t>Initial CR Domain Overview. Establishes the CR domain purpose, five sub-domains (CR-PARTNER, CR-MARKETING, CR-EVENTS, CR-REACTIVATE), seven processes in dependency order, persona scoping, entity summary, and open-issues carried forward.</w:t>
             </w:r>
           </w:p>
         </w:tc>

</xml_diff>